<commit_message>
All 20 CONUS variants: level-calibrated localized max beats native in 19
Full per-variant SDIMAX level sweep through the engine. Calibrated localized maximum
<= native RMSE in 19/20 variants (UT exception); optimal level 0.6-2.0, median 1.2 (no
uniform drop-in). Big gains where native level most off (NC 75->54, ACD 53->37, NE 35->31).
Updates report, deck, and Word doc with the all-variant table + figure; adds
allvar_calibration.csv and figure.
</commit_message>
<xml_diff>
--- a/calibration/sdimax/FVS_team_report_CONUS_maxSDI.docx
+++ b/calibration/sdimax/FVS_team_report_CONUS_maxSDI.docx
@@ -1333,6 +1333,862 @@
       </w:pPr>
       <w:r>
         <w:t xml:space="preserve">A joint analysis on 7.25 million remeasured plots across 19 FVS regions yields two results. First, the predictive skill of a flexible self-thinning fit is invariant to the maximum's overall level, so the FIA maximum's statistical value is in its spatial pattern and the level is necessarily set by the mortality model. That is the formal reason the level was invisible in the statistical test yet decisive in the FVS projection. Second, the strength of the self-thinning signal varies about four-fold by region: weakest in the dry interior West (Utah 0.04, Central Idaho 0.05, Central Rockies 0.06) and strongest in the moist East, South, and Pacific Northwest (Southern 0.14, Blue Mountains 0.12, Pacific Northwest 0.10, Northeast 0.10). Density-dependent self-thinning is a primary mortality control where growth is fast and canopies close, and a secondary one where drought and disturbance dominate.</w:t>
+      </w:r>
+    </w:p>
+    <w:p>
+      <w:pPr>
+        <w:pStyle w:val="Heading2"/>
+      </w:pPr>
+      <w:r>
+        <w:t xml:space="preserve">All-variant level calibration</w:t>
+      </w:r>
+    </w:p>
+    <w:p>
+      <w:pPr>
+        <w:spacing w:after="140" w:line="276"/>
+      </w:pPr>
+      <w:r>
+        <w:t xml:space="preserve">Sweeping the level applied to the localized maximum through the real FVS mortality response, for every CONUS regional variant, gives two results. The level-calibrated localized maximum matches or beats the native species-weighted maximum in 19 of the 20 variants (the lone exception is Utah), with substantial gains where the native level was most off (Klamath Mountains 75 to 54 percent RMSE, Acadian 53 to 37, Northeast 35 to 31). And the optimal level is strongly variant-specific, spanning 0.6 to 2.0 with a median near 1.2: most variants need the brms maximum scaled up to match their native mortality, a few need it scaled down. The more than three-fold spread is direct evidence that a common FIA maximum cannot be dropped into native variants at a uniform level; each needs its own, estimated jointly with that variant's mortality.</w:t>
+      </w:r>
+    </w:p>
+    <w:tbl>
+      <w:tblPr>
+        <w:tblW w:type="dxa" w:w="9360"/>
+        <w:tblBorders>
+          <w:top w:val="single" w:color="CCCCCC" w:sz="1"/>
+          <w:left w:val="single" w:color="CCCCCC" w:sz="1"/>
+          <w:bottom w:val="single" w:color="CCCCCC" w:sz="1"/>
+          <w:right w:val="single" w:color="CCCCCC" w:sz="1"/>
+          <w:insideH w:val="single" w:color="CCCCCC" w:sz="1"/>
+          <w:insideV w:val="single" w:color="CCCCCC" w:sz="1"/>
+        </w:tblBorders>
+      </w:tblPr>
+      <w:tblGrid>
+        <w:gridCol w:w="2400"/>
+        <w:gridCol w:w="2300"/>
+        <w:gridCol w:w="2330"/>
+        <w:gridCol w:w="2330"/>
+      </w:tblGrid>
+      <w:tr>
+        <w:trPr>
+          <w:tblHeader/>
+        </w:trPr>
+        <w:tc>
+          <w:tcPr>
+            <w:tcW w:type="dxa" w:w="2400"/>
+            <w:shd w:fill="1A3D28" w:val="clear"/>
+            <w:tcMar>
+              <w:top w:type="dxa" w:w="60"/>
+              <w:left w:type="dxa" w:w="120"/>
+              <w:bottom w:type="dxa" w:w="60"/>
+              <w:right w:type="dxa" w:w="120"/>
+            </w:tcMar>
+          </w:tcPr>
+          <w:p>
+            <w:r>
+              <w:rPr>
+                <w:b/>
+                <w:bCs/>
+                <w:color w:val="FFFFFF"/>
+                <w:sz w:val="19"/>
+                <w:szCs w:val="19"/>
+              </w:rPr>
+              <w:t xml:space="preserve">Variant</w:t>
+            </w:r>
+          </w:p>
+        </w:tc>
+        <w:tc>
+          <w:tcPr>
+            <w:tcW w:type="dxa" w:w="2300"/>
+            <w:shd w:fill="1A3D28" w:val="clear"/>
+            <w:tcMar>
+              <w:top w:type="dxa" w:w="60"/>
+              <w:left w:type="dxa" w:w="120"/>
+              <w:bottom w:type="dxa" w:w="60"/>
+              <w:right w:type="dxa" w:w="120"/>
+            </w:tcMar>
+          </w:tcPr>
+          <w:p>
+            <w:r>
+              <w:rPr>
+                <w:b/>
+                <w:bCs/>
+                <w:color w:val="FFFFFF"/>
+                <w:sz w:val="19"/>
+                <w:szCs w:val="19"/>
+              </w:rPr>
+              <w:t xml:space="preserve">Native % RMSE</w:t>
+            </w:r>
+          </w:p>
+        </w:tc>
+        <w:tc>
+          <w:tcPr>
+            <w:tcW w:type="dxa" w:w="2330"/>
+            <w:shd w:fill="1A3D28" w:val="clear"/>
+            <w:tcMar>
+              <w:top w:type="dxa" w:w="60"/>
+              <w:left w:type="dxa" w:w="120"/>
+              <w:bottom w:type="dxa" w:w="60"/>
+              <w:right w:type="dxa" w:w="120"/>
+            </w:tcMar>
+          </w:tcPr>
+          <w:p>
+            <w:r>
+              <w:rPr>
+                <w:b/>
+                <w:bCs/>
+                <w:color w:val="FFFFFF"/>
+                <w:sz w:val="19"/>
+                <w:szCs w:val="19"/>
+              </w:rPr>
+              <w:t xml:space="preserve">Calibrated % RMSE</w:t>
+            </w:r>
+          </w:p>
+        </w:tc>
+        <w:tc>
+          <w:tcPr>
+            <w:tcW w:type="dxa" w:w="2330"/>
+            <w:shd w:fill="1A3D28" w:val="clear"/>
+            <w:tcMar>
+              <w:top w:type="dxa" w:w="60"/>
+              <w:left w:type="dxa" w:w="120"/>
+              <w:bottom w:type="dxa" w:w="60"/>
+              <w:right w:type="dxa" w:w="120"/>
+            </w:tcMar>
+          </w:tcPr>
+          <w:p>
+            <w:r>
+              <w:rPr>
+                <w:b/>
+                <w:bCs/>
+                <w:color w:val="FFFFFF"/>
+                <w:sz w:val="19"/>
+                <w:szCs w:val="19"/>
+              </w:rPr>
+              <w:t xml:space="preserve">Optimal level</w:t>
+            </w:r>
+          </w:p>
+        </w:tc>
+      </w:tr>
+      <w:tr>
+        <w:tc>
+          <w:tcPr>
+            <w:tcW w:type="dxa" w:w="2400"/>
+            <w:tcMar>
+              <w:top w:type="dxa" w:w="50"/>
+              <w:left w:type="dxa" w:w="120"/>
+              <w:bottom w:type="dxa" w:w="50"/>
+              <w:right w:type="dxa" w:w="120"/>
+            </w:tcMar>
+          </w:tcPr>
+          <w:p>
+            <w:r>
+              <w:rPr>
+                <w:b w:val="false"/>
+                <w:bCs w:val="false"/>
+                <w:color w:val="333333"/>
+                <w:sz w:val="19"/>
+                <w:szCs w:val="19"/>
+              </w:rPr>
+              <w:t xml:space="preserve">NE Northeast</w:t>
+            </w:r>
+          </w:p>
+        </w:tc>
+        <w:tc>
+          <w:tcPr>
+            <w:tcW w:type="dxa" w:w="2300"/>
+            <w:tcMar>
+              <w:top w:type="dxa" w:w="50"/>
+              <w:left w:type="dxa" w:w="120"/>
+              <w:bottom w:type="dxa" w:w="50"/>
+              <w:right w:type="dxa" w:w="120"/>
+            </w:tcMar>
+          </w:tcPr>
+          <w:p>
+            <w:r>
+              <w:rPr>
+                <w:b w:val="false"/>
+                <w:bCs w:val="false"/>
+                <w:color w:val="333333"/>
+                <w:sz w:val="19"/>
+                <w:szCs w:val="19"/>
+              </w:rPr>
+              <w:t xml:space="preserve">34.6</w:t>
+            </w:r>
+          </w:p>
+        </w:tc>
+        <w:tc>
+          <w:tcPr>
+            <w:tcW w:type="dxa" w:w="2330"/>
+            <w:tcMar>
+              <w:top w:type="dxa" w:w="50"/>
+              <w:left w:type="dxa" w:w="120"/>
+              <w:bottom w:type="dxa" w:w="50"/>
+              <w:right w:type="dxa" w:w="120"/>
+            </w:tcMar>
+          </w:tcPr>
+          <w:p>
+            <w:r>
+              <w:rPr>
+                <w:b/>
+                <w:bCs/>
+                <w:color w:val="1A3D28"/>
+                <w:sz w:val="19"/>
+                <w:szCs w:val="19"/>
+              </w:rPr>
+              <w:t xml:space="preserve">30.5</w:t>
+            </w:r>
+          </w:p>
+        </w:tc>
+        <w:tc>
+          <w:tcPr>
+            <w:tcW w:type="dxa" w:w="2330"/>
+            <w:tcMar>
+              <w:top w:type="dxa" w:w="50"/>
+              <w:left w:type="dxa" w:w="120"/>
+              <w:bottom w:type="dxa" w:w="50"/>
+              <w:right w:type="dxa" w:w="120"/>
+            </w:tcMar>
+          </w:tcPr>
+          <w:p>
+            <w:r>
+              <w:rPr>
+                <w:b w:val="false"/>
+                <w:bCs w:val="false"/>
+                <w:color w:val="333333"/>
+                <w:sz w:val="19"/>
+                <w:szCs w:val="19"/>
+              </w:rPr>
+              <w:t xml:space="preserve">1.8</w:t>
+            </w:r>
+          </w:p>
+        </w:tc>
+      </w:tr>
+      <w:tr>
+        <w:tc>
+          <w:tcPr>
+            <w:tcW w:type="dxa" w:w="2400"/>
+            <w:tcMar>
+              <w:top w:type="dxa" w:w="50"/>
+              <w:left w:type="dxa" w:w="120"/>
+              <w:bottom w:type="dxa" w:w="50"/>
+              <w:right w:type="dxa" w:w="120"/>
+            </w:tcMar>
+          </w:tcPr>
+          <w:p>
+            <w:r>
+              <w:rPr>
+                <w:b w:val="false"/>
+                <w:bCs w:val="false"/>
+                <w:color w:val="333333"/>
+                <w:sz w:val="19"/>
+                <w:szCs w:val="19"/>
+              </w:rPr>
+              <w:t xml:space="preserve">ACD Acadian</w:t>
+            </w:r>
+          </w:p>
+        </w:tc>
+        <w:tc>
+          <w:tcPr>
+            <w:tcW w:type="dxa" w:w="2300"/>
+            <w:tcMar>
+              <w:top w:type="dxa" w:w="50"/>
+              <w:left w:type="dxa" w:w="120"/>
+              <w:bottom w:type="dxa" w:w="50"/>
+              <w:right w:type="dxa" w:w="120"/>
+            </w:tcMar>
+          </w:tcPr>
+          <w:p>
+            <w:r>
+              <w:rPr>
+                <w:b w:val="false"/>
+                <w:bCs w:val="false"/>
+                <w:color w:val="333333"/>
+                <w:sz w:val="19"/>
+                <w:szCs w:val="19"/>
+              </w:rPr>
+              <w:t xml:space="preserve">52.8</w:t>
+            </w:r>
+          </w:p>
+        </w:tc>
+        <w:tc>
+          <w:tcPr>
+            <w:tcW w:type="dxa" w:w="2330"/>
+            <w:tcMar>
+              <w:top w:type="dxa" w:w="50"/>
+              <w:left w:type="dxa" w:w="120"/>
+              <w:bottom w:type="dxa" w:w="50"/>
+              <w:right w:type="dxa" w:w="120"/>
+            </w:tcMar>
+          </w:tcPr>
+          <w:p>
+            <w:r>
+              <w:rPr>
+                <w:b/>
+                <w:bCs/>
+                <w:color w:val="1A3D28"/>
+                <w:sz w:val="19"/>
+                <w:szCs w:val="19"/>
+              </w:rPr>
+              <w:t xml:space="preserve">36.9</w:t>
+            </w:r>
+          </w:p>
+        </w:tc>
+        <w:tc>
+          <w:tcPr>
+            <w:tcW w:type="dxa" w:w="2330"/>
+            <w:tcMar>
+              <w:top w:type="dxa" w:w="50"/>
+              <w:left w:type="dxa" w:w="120"/>
+              <w:bottom w:type="dxa" w:w="50"/>
+              <w:right w:type="dxa" w:w="120"/>
+            </w:tcMar>
+          </w:tcPr>
+          <w:p>
+            <w:r>
+              <w:rPr>
+                <w:b w:val="false"/>
+                <w:bCs w:val="false"/>
+                <w:color w:val="333333"/>
+                <w:sz w:val="19"/>
+                <w:szCs w:val="19"/>
+              </w:rPr>
+              <w:t xml:space="preserve">2.0</w:t>
+            </w:r>
+          </w:p>
+        </w:tc>
+      </w:tr>
+      <w:tr>
+        <w:tc>
+          <w:tcPr>
+            <w:tcW w:type="dxa" w:w="2400"/>
+            <w:tcMar>
+              <w:top w:type="dxa" w:w="50"/>
+              <w:left w:type="dxa" w:w="120"/>
+              <w:bottom w:type="dxa" w:w="50"/>
+              <w:right w:type="dxa" w:w="120"/>
+            </w:tcMar>
+          </w:tcPr>
+          <w:p>
+            <w:r>
+              <w:rPr>
+                <w:b w:val="false"/>
+                <w:bCs w:val="false"/>
+                <w:color w:val="333333"/>
+                <w:sz w:val="19"/>
+                <w:szCs w:val="19"/>
+              </w:rPr>
+              <w:t xml:space="preserve">NC Klamath Mtns</w:t>
+            </w:r>
+          </w:p>
+        </w:tc>
+        <w:tc>
+          <w:tcPr>
+            <w:tcW w:type="dxa" w:w="2300"/>
+            <w:tcMar>
+              <w:top w:type="dxa" w:w="50"/>
+              <w:left w:type="dxa" w:w="120"/>
+              <w:bottom w:type="dxa" w:w="50"/>
+              <w:right w:type="dxa" w:w="120"/>
+            </w:tcMar>
+          </w:tcPr>
+          <w:p>
+            <w:r>
+              <w:rPr>
+                <w:b w:val="false"/>
+                <w:bCs w:val="false"/>
+                <w:color w:val="333333"/>
+                <w:sz w:val="19"/>
+                <w:szCs w:val="19"/>
+              </w:rPr>
+              <w:t xml:space="preserve">75.2</w:t>
+            </w:r>
+          </w:p>
+        </w:tc>
+        <w:tc>
+          <w:tcPr>
+            <w:tcW w:type="dxa" w:w="2330"/>
+            <w:tcMar>
+              <w:top w:type="dxa" w:w="50"/>
+              <w:left w:type="dxa" w:w="120"/>
+              <w:bottom w:type="dxa" w:w="50"/>
+              <w:right w:type="dxa" w:w="120"/>
+            </w:tcMar>
+          </w:tcPr>
+          <w:p>
+            <w:r>
+              <w:rPr>
+                <w:b/>
+                <w:bCs/>
+                <w:color w:val="1A3D28"/>
+                <w:sz w:val="19"/>
+                <w:szCs w:val="19"/>
+              </w:rPr>
+              <w:t xml:space="preserve">54.0</w:t>
+            </w:r>
+          </w:p>
+        </w:tc>
+        <w:tc>
+          <w:tcPr>
+            <w:tcW w:type="dxa" w:w="2330"/>
+            <w:tcMar>
+              <w:top w:type="dxa" w:w="50"/>
+              <w:left w:type="dxa" w:w="120"/>
+              <w:bottom w:type="dxa" w:w="50"/>
+              <w:right w:type="dxa" w:w="120"/>
+            </w:tcMar>
+          </w:tcPr>
+          <w:p>
+            <w:r>
+              <w:rPr>
+                <w:b w:val="false"/>
+                <w:bCs w:val="false"/>
+                <w:color w:val="333333"/>
+                <w:sz w:val="19"/>
+                <w:szCs w:val="19"/>
+              </w:rPr>
+              <w:t xml:space="preserve">2.0</w:t>
+            </w:r>
+          </w:p>
+        </w:tc>
+      </w:tr>
+      <w:tr>
+        <w:tc>
+          <w:tcPr>
+            <w:tcW w:type="dxa" w:w="2400"/>
+            <w:tcMar>
+              <w:top w:type="dxa" w:w="50"/>
+              <w:left w:type="dxa" w:w="120"/>
+              <w:bottom w:type="dxa" w:w="50"/>
+              <w:right w:type="dxa" w:w="120"/>
+            </w:tcMar>
+          </w:tcPr>
+          <w:p>
+            <w:r>
+              <w:rPr>
+                <w:b w:val="false"/>
+                <w:bCs w:val="false"/>
+                <w:color w:val="333333"/>
+                <w:sz w:val="19"/>
+                <w:szCs w:val="19"/>
+              </w:rPr>
+              <w:t xml:space="preserve">CR Central Rockies</w:t>
+            </w:r>
+          </w:p>
+        </w:tc>
+        <w:tc>
+          <w:tcPr>
+            <w:tcW w:type="dxa" w:w="2300"/>
+            <w:tcMar>
+              <w:top w:type="dxa" w:w="50"/>
+              <w:left w:type="dxa" w:w="120"/>
+              <w:bottom w:type="dxa" w:w="50"/>
+              <w:right w:type="dxa" w:w="120"/>
+            </w:tcMar>
+          </w:tcPr>
+          <w:p>
+            <w:r>
+              <w:rPr>
+                <w:b w:val="false"/>
+                <w:bCs w:val="false"/>
+                <w:color w:val="333333"/>
+                <w:sz w:val="19"/>
+                <w:szCs w:val="19"/>
+              </w:rPr>
+              <w:t xml:space="preserve">49.0</w:t>
+            </w:r>
+          </w:p>
+        </w:tc>
+        <w:tc>
+          <w:tcPr>
+            <w:tcW w:type="dxa" w:w="2330"/>
+            <w:tcMar>
+              <w:top w:type="dxa" w:w="50"/>
+              <w:left w:type="dxa" w:w="120"/>
+              <w:bottom w:type="dxa" w:w="50"/>
+              <w:right w:type="dxa" w:w="120"/>
+            </w:tcMar>
+          </w:tcPr>
+          <w:p>
+            <w:r>
+              <w:rPr>
+                <w:b/>
+                <w:bCs/>
+                <w:color w:val="1A3D28"/>
+                <w:sz w:val="19"/>
+                <w:szCs w:val="19"/>
+              </w:rPr>
+              <w:t xml:space="preserve">47.3</w:t>
+            </w:r>
+          </w:p>
+        </w:tc>
+        <w:tc>
+          <w:tcPr>
+            <w:tcW w:type="dxa" w:w="2330"/>
+            <w:tcMar>
+              <w:top w:type="dxa" w:w="50"/>
+              <w:left w:type="dxa" w:w="120"/>
+              <w:bottom w:type="dxa" w:w="50"/>
+              <w:right w:type="dxa" w:w="120"/>
+            </w:tcMar>
+          </w:tcPr>
+          <w:p>
+            <w:r>
+              <w:rPr>
+                <w:b w:val="false"/>
+                <w:bCs w:val="false"/>
+                <w:color w:val="333333"/>
+                <w:sz w:val="19"/>
+                <w:szCs w:val="19"/>
+              </w:rPr>
+              <w:t xml:space="preserve">1.0</w:t>
+            </w:r>
+          </w:p>
+        </w:tc>
+      </w:tr>
+      <w:tr>
+        <w:tc>
+          <w:tcPr>
+            <w:tcW w:type="dxa" w:w="2400"/>
+            <w:tcMar>
+              <w:top w:type="dxa" w:w="50"/>
+              <w:left w:type="dxa" w:w="120"/>
+              <w:bottom w:type="dxa" w:w="50"/>
+              <w:right w:type="dxa" w:w="120"/>
+            </w:tcMar>
+          </w:tcPr>
+          <w:p>
+            <w:r>
+              <w:rPr>
+                <w:b w:val="false"/>
+                <w:bCs w:val="false"/>
+                <w:color w:val="333333"/>
+                <w:sz w:val="19"/>
+                <w:szCs w:val="19"/>
+              </w:rPr>
+              <w:t xml:space="preserve">IE Inland Empire</w:t>
+            </w:r>
+          </w:p>
+        </w:tc>
+        <w:tc>
+          <w:tcPr>
+            <w:tcW w:type="dxa" w:w="2300"/>
+            <w:tcMar>
+              <w:top w:type="dxa" w:w="50"/>
+              <w:left w:type="dxa" w:w="120"/>
+              <w:bottom w:type="dxa" w:w="50"/>
+              <w:right w:type="dxa" w:w="120"/>
+            </w:tcMar>
+          </w:tcPr>
+          <w:p>
+            <w:r>
+              <w:rPr>
+                <w:b w:val="false"/>
+                <w:bCs w:val="false"/>
+                <w:color w:val="333333"/>
+                <w:sz w:val="19"/>
+                <w:szCs w:val="19"/>
+              </w:rPr>
+              <w:t xml:space="preserve">66.1</w:t>
+            </w:r>
+          </w:p>
+        </w:tc>
+        <w:tc>
+          <w:tcPr>
+            <w:tcW w:type="dxa" w:w="2330"/>
+            <w:tcMar>
+              <w:top w:type="dxa" w:w="50"/>
+              <w:left w:type="dxa" w:w="120"/>
+              <w:bottom w:type="dxa" w:w="50"/>
+              <w:right w:type="dxa" w:w="120"/>
+            </w:tcMar>
+          </w:tcPr>
+          <w:p>
+            <w:r>
+              <w:rPr>
+                <w:b/>
+                <w:bCs/>
+                <w:color w:val="1A3D28"/>
+                <w:sz w:val="19"/>
+                <w:szCs w:val="19"/>
+              </w:rPr>
+              <w:t xml:space="preserve">60.9</w:t>
+            </w:r>
+          </w:p>
+        </w:tc>
+        <w:tc>
+          <w:tcPr>
+            <w:tcW w:type="dxa" w:w="2330"/>
+            <w:tcMar>
+              <w:top w:type="dxa" w:w="50"/>
+              <w:left w:type="dxa" w:w="120"/>
+              <w:bottom w:type="dxa" w:w="50"/>
+              <w:right w:type="dxa" w:w="120"/>
+            </w:tcMar>
+          </w:tcPr>
+          <w:p>
+            <w:r>
+              <w:rPr>
+                <w:b w:val="false"/>
+                <w:bCs w:val="false"/>
+                <w:color w:val="333333"/>
+                <w:sz w:val="19"/>
+                <w:szCs w:val="19"/>
+              </w:rPr>
+              <w:t xml:space="preserve">0.8</w:t>
+            </w:r>
+          </w:p>
+        </w:tc>
+      </w:tr>
+      <w:tr>
+        <w:tc>
+          <w:tcPr>
+            <w:tcW w:type="dxa" w:w="2400"/>
+            <w:tcMar>
+              <w:top w:type="dxa" w:w="50"/>
+              <w:left w:type="dxa" w:w="120"/>
+              <w:bottom w:type="dxa" w:w="50"/>
+              <w:right w:type="dxa" w:w="120"/>
+            </w:tcMar>
+          </w:tcPr>
+          <w:p>
+            <w:r>
+              <w:rPr>
+                <w:b w:val="false"/>
+                <w:bCs w:val="false"/>
+                <w:color w:val="333333"/>
+                <w:sz w:val="19"/>
+                <w:szCs w:val="19"/>
+              </w:rPr>
+              <w:t xml:space="preserve">SN Southern</w:t>
+            </w:r>
+          </w:p>
+        </w:tc>
+        <w:tc>
+          <w:tcPr>
+            <w:tcW w:type="dxa" w:w="2300"/>
+            <w:tcMar>
+              <w:top w:type="dxa" w:w="50"/>
+              <w:left w:type="dxa" w:w="120"/>
+              <w:bottom w:type="dxa" w:w="50"/>
+              <w:right w:type="dxa" w:w="120"/>
+            </w:tcMar>
+          </w:tcPr>
+          <w:p>
+            <w:r>
+              <w:rPr>
+                <w:b w:val="false"/>
+                <w:bCs w:val="false"/>
+                <w:color w:val="333333"/>
+                <w:sz w:val="19"/>
+                <w:szCs w:val="19"/>
+              </w:rPr>
+              <w:t xml:space="preserve">96.2</w:t>
+            </w:r>
+          </w:p>
+        </w:tc>
+        <w:tc>
+          <w:tcPr>
+            <w:tcW w:type="dxa" w:w="2330"/>
+            <w:tcMar>
+              <w:top w:type="dxa" w:w="50"/>
+              <w:left w:type="dxa" w:w="120"/>
+              <w:bottom w:type="dxa" w:w="50"/>
+              <w:right w:type="dxa" w:w="120"/>
+            </w:tcMar>
+          </w:tcPr>
+          <w:p>
+            <w:r>
+              <w:rPr>
+                <w:b/>
+                <w:bCs/>
+                <w:color w:val="1A3D28"/>
+                <w:sz w:val="19"/>
+                <w:szCs w:val="19"/>
+              </w:rPr>
+              <w:t xml:space="preserve">91.9</w:t>
+            </w:r>
+          </w:p>
+        </w:tc>
+        <w:tc>
+          <w:tcPr>
+            <w:tcW w:type="dxa" w:w="2330"/>
+            <w:tcMar>
+              <w:top w:type="dxa" w:w="50"/>
+              <w:left w:type="dxa" w:w="120"/>
+              <w:bottom w:type="dxa" w:w="50"/>
+              <w:right w:type="dxa" w:w="120"/>
+            </w:tcMar>
+          </w:tcPr>
+          <w:p>
+            <w:r>
+              <w:rPr>
+                <w:b w:val="false"/>
+                <w:bCs w:val="false"/>
+                <w:color w:val="333333"/>
+                <w:sz w:val="19"/>
+                <w:szCs w:val="19"/>
+              </w:rPr>
+              <w:t xml:space="preserve">0.8</w:t>
+            </w:r>
+          </w:p>
+        </w:tc>
+      </w:tr>
+      <w:tr>
+        <w:tc>
+          <w:tcPr>
+            <w:tcW w:type="dxa" w:w="2400"/>
+            <w:tcMar>
+              <w:top w:type="dxa" w:w="50"/>
+              <w:left w:type="dxa" w:w="120"/>
+              <w:bottom w:type="dxa" w:w="50"/>
+              <w:right w:type="dxa" w:w="120"/>
+            </w:tcMar>
+          </w:tcPr>
+          <w:p>
+            <w:r>
+              <w:rPr>
+                <w:b w:val="false"/>
+                <w:bCs w:val="false"/>
+                <w:color w:val="333333"/>
+                <w:sz w:val="19"/>
+                <w:szCs w:val="19"/>
+              </w:rPr>
+              <w:t xml:space="preserve">UT Utah (exception)</w:t>
+            </w:r>
+          </w:p>
+        </w:tc>
+        <w:tc>
+          <w:tcPr>
+            <w:tcW w:type="dxa" w:w="2300"/>
+            <w:tcMar>
+              <w:top w:type="dxa" w:w="50"/>
+              <w:left w:type="dxa" w:w="120"/>
+              <w:bottom w:type="dxa" w:w="50"/>
+              <w:right w:type="dxa" w:w="120"/>
+            </w:tcMar>
+          </w:tcPr>
+          <w:p>
+            <w:r>
+              <w:rPr>
+                <w:b w:val="false"/>
+                <w:bCs w:val="false"/>
+                <w:color w:val="333333"/>
+                <w:sz w:val="19"/>
+                <w:szCs w:val="19"/>
+              </w:rPr>
+              <w:t xml:space="preserve">64.5</w:t>
+            </w:r>
+          </w:p>
+        </w:tc>
+        <w:tc>
+          <w:tcPr>
+            <w:tcW w:type="dxa" w:w="2330"/>
+            <w:tcMar>
+              <w:top w:type="dxa" w:w="50"/>
+              <w:left w:type="dxa" w:w="120"/>
+              <w:bottom w:type="dxa" w:w="50"/>
+              <w:right w:type="dxa" w:w="120"/>
+            </w:tcMar>
+          </w:tcPr>
+          <w:p>
+            <w:r>
+              <w:rPr>
+                <w:b w:val="false"/>
+                <w:bCs w:val="false"/>
+                <w:color w:val="333333"/>
+                <w:sz w:val="19"/>
+                <w:szCs w:val="19"/>
+              </w:rPr>
+              <w:t xml:space="preserve">66.7</w:t>
+            </w:r>
+          </w:p>
+        </w:tc>
+        <w:tc>
+          <w:tcPr>
+            <w:tcW w:type="dxa" w:w="2330"/>
+            <w:tcMar>
+              <w:top w:type="dxa" w:w="50"/>
+              <w:left w:type="dxa" w:w="120"/>
+              <w:bottom w:type="dxa" w:w="50"/>
+              <w:right w:type="dxa" w:w="120"/>
+            </w:tcMar>
+          </w:tcPr>
+          <w:p>
+            <w:r>
+              <w:rPr>
+                <w:b w:val="false"/>
+                <w:bCs w:val="false"/>
+                <w:color w:val="333333"/>
+                <w:sz w:val="19"/>
+                <w:szCs w:val="19"/>
+              </w:rPr>
+              <w:t xml:space="preserve">1.2</w:t>
+            </w:r>
+          </w:p>
+        </w:tc>
+      </w:tr>
+    </w:tbl>
+    <w:p>
+      <w:pPr>
+        <w:spacing w:after="60" w:before="80"/>
+        <w:jc w:val="center"/>
+      </w:pPr>
+      <w:r>
+        <w:drawing>
+          <wp:inline distT="0" distB="0" distL="0" distR="0">
+            <wp:extent cx="5905500" cy="3190875"/>
+            <wp:effectExtent t="0" r="0" b="0" l="0"/>
+            <wp:docPr id="1" name="allvar_level_calibration.png" descr="allvar_level_calibration.png" title="allvar_level_calibration.png"/>
+            <wp:cNvGraphicFramePr>
+              <a:graphicFrameLocks xmlns:a="http://schemas.openxmlformats.org/drawingml/2006/main" noChangeAspect="1"/>
+            </wp:cNvGraphicFramePr>
+            <a:graphic xmlns:a="http://schemas.openxmlformats.org/drawingml/2006/main">
+              <a:graphicData uri="http://schemas.openxmlformats.org/drawingml/2006/picture">
+                <pic:pic xmlns:pic="http://schemas.openxmlformats.org/drawingml/2006/picture">
+                  <pic:nvPicPr>
+                    <pic:cNvPr id="0" name="" descr=""/>
+                    <pic:cNvPicPr>
+                      <a:picLocks noChangeAspect="1" noChangeArrowheads="1"/>
+                    </pic:cNvPicPr>
+                  </pic:nvPicPr>
+                  <pic:blipFill>
+                    <a:blip r:embed="rId11" cstate="none"/>
+                    <a:srcRect/>
+                    <a:stretch>
+                      <a:fillRect/>
+                    </a:stretch>
+                  </pic:blipFill>
+                  <pic:spPr bwMode="auto">
+                    <a:xfrm>
+                      <a:off x="0" y="0"/>
+                      <a:ext cx="5905500" cy="3190875"/>
+                    </a:xfrm>
+                    <a:prstGeom prst="rect">
+                      <a:avLst/>
+                    </a:prstGeom>
+                  </pic:spPr>
+                </pic:pic>
+              </a:graphicData>
+            </a:graphic>
+          </wp:inline>
+        </w:drawing>
+      </w:r>
+    </w:p>
+    <w:p>
+      <w:pPr>
+        <w:spacing w:after="160"/>
+        <w:jc w:val="center"/>
+      </w:pPr>
+      <w:r>
+        <w:rPr>
+          <w:i/>
+          <w:iCs/>
+          <w:color w:val="666666"/>
+          <w:sz w:val="18"/>
+          <w:szCs w:val="18"/>
+        </w:rPr>
+        <w:t xml:space="preserve">Figure 3. Per-variant level calibration across all 20 CONUS variants. Left: native versus level-calibrated density error; calibrated is at or below native in 19 of 20. Right: the optimal level is variant-specific, 0.6 to 2.0, median 1.2.</w:t>
       </w:r>
     </w:p>
     <w:p>

</xml_diff>